<commit_message>
One CV, with the banking history on it
The routine reads one document at run time, so the folder now holds exactly one:
FDE and Software-Engineer positionings merged, US-Letter copies removed. Backups
are held outside the repo.

Adds the dated earlier career the CV had been omitting — Askari Commercial Bank
(Admin & Accounts Officer OG-II, Feb 2007 - Jan 2009), Kay & A (Oct 2006 - Feb
2007), B.Com, and the General Banking Course. Placed below Projects so the
engineering work still reads first. The PTV internship (2001) was left off.

Drops "15 years in education and finance" from both the CV and the fact sheet.
Dated employment totals under six years, so with real dates now printed the
phrase contradicted the page it sat on.

The 2009-2023 gap this exposes is recorded as an honest gap, not hidden.

Co-Authored-By: Claude Opus 5 (1M context) <noreply@anthropic.com>
</commit_message>
<xml_diff>
--- a/assets/FDE-CV/Maleeha-Bilal-CV-Forward-Deployed-Engineer-A4.docx
+++ b/assets/FDE-CV/Maleeha-Bilal-CV-Forward-Deployed-Engineer-A4.docx
@@ -28,7 +28,7 @@
           <w:sz w:val="22"/>
           <w:szCs w:val="22"/>
         </w:rPr>
-        <w:t xml:space="preserve">Forward Deployed Engineer  ·  Client-Facing Delivery &amp; Automation</w:t>
+        <w:t>Forward Deployed Engineer · Software Engineer  ·  Client-Facing Delivery, Full-Stack &amp; Automation</w:t>
       </w:r>
     </w:p>
     <w:p>
@@ -149,7 +149,7 @@
           <w:sz w:val="21"/>
           <w:szCs w:val="21"/>
         </w:rPr>
-        <w:t xml:space="preserve">Engineer who takes client problems from requirements through to production — scoping, building, deploying and supporting software in client-facing settings. Delivers across web, mobile and cloud automation in TypeScript and Python, using spec-driven development, written runbooks and agent tooling (MCP). Career changer with 15 years in education and finance, now building software full-time. MSc Economics &amp; Finance, Distinction (CGPA 3.92/4.00).</w:t>
+        <w:t>Engineer who takes client problems from requirements through to production — scoping, building, deploying and supporting software in client-facing settings. Delivers across web, mobile and cloud automation in TypeScript and Python, using spec-driven development, written runbooks and agent tooling (MCP). Career changer from banking operations and economics teaching, now building software full-time — prior audit, reconciliation and financial-statement work gives direct domain literacy for financial-services delivery. MSc Economics &amp; Finance, Distinction (CGPA 3.92/4.00).</w:t>
       </w:r>
     </w:p>
     <w:p>
@@ -769,62 +769,93 @@
           <w:sz w:val="20"/>
           <w:szCs w:val="20"/>
         </w:rPr>
-        <w:t xml:space="preserve">Education</w:t>
-      </w:r>
-    </w:p>
-    <w:p>
-      <w:pPr>
-        <w:spacing w:before="0" w:after="15" w:line="230" w:lineRule="auto"/>
-      </w:pPr>
-      <w:r>
-        <w:rPr>
-          <w:b/>
-          <w:sz w:val="20"/>
-          <w:szCs w:val="20"/>
-        </w:rPr>
-        <w:t xml:space="preserve">Agentic AI &amp; Robotics Engineering — Panaversity / PIAIC, Batch 83</w:t>
-      </w:r>
-      <w:r>
-        <w:rPr>
-          <w:color w:val="3D4852"/>
-          <w:sz w:val="19"/>
-          <w:szCs w:val="19"/>
-        </w:rPr>
-        <w:t xml:space="preserve"> In progress · expected May 2027</w:t>
-      </w:r>
-    </w:p>
-    <w:p>
-      <w:pPr>
-        <w:spacing w:before="0" w:after="15" w:line="230" w:lineRule="auto"/>
-      </w:pPr>
-      <w:r>
-        <w:rPr>
-          <w:b/>
-          <w:sz w:val="20"/>
-          <w:szCs w:val="20"/>
-        </w:rPr>
-        <w:t xml:space="preserve">MSc Economics &amp; Finance — International Islamic University Islamabad</w:t>
-      </w:r>
-      <w:r>
-        <w:rPr>
-          <w:color w:val="3D4852"/>
-          <w:sz w:val="19"/>
-          <w:szCs w:val="19"/>
-        </w:rPr>
-        <w:t xml:space="preserve"> Distinction · CGPA 3.92 / 4.00</w:t>
-      </w:r>
-    </w:p>
-    <w:p>
-      <w:pPr>
-        <w:spacing w:before="0" w:after="15" w:line="230" w:lineRule="auto"/>
-      </w:pPr>
-      <w:r>
-        <w:rPr>
-          <w:b/>
-          <w:sz w:val="20"/>
-          <w:szCs w:val="20"/>
-        </w:rPr>
-        <w:t xml:space="preserve">Bachelor of Education — Allama Iqbal Open University</w:t>
+        <w:t>Earlier Career — Banking &amp; Finance</w:t>
+      </w:r>
+    </w:p>
+    <w:p>
+      <w:pPr>
+        <w:keepNext/>
+        <w:keepLines/>
+        <w:spacing w:before="75" w:after="15" w:line="230" w:lineRule="auto"/>
+      </w:pPr>
+      <w:r>
+        <w:rPr>
+          <w:b/>
+          <w:sz w:val="21"/>
+          <w:szCs w:val="21"/>
+        </w:rPr>
+        <w:t>Admin &amp; Accounts Officer (OG-II) — Askari Commercial Bank Ltd, Islamic Banking Branch</w:t>
+      </w:r>
+      <w:r>
+        <w:rPr>
+          <w:color w:val="3D4852"/>
+          <w:sz w:val="19"/>
+          <w:szCs w:val="19"/>
+        </w:rPr>
+        <w:t xml:space="preserve"> Islamabad  ·  Feb 2007 – Jan 2009</w:t>
+      </w:r>
+    </w:p>
+    <w:p>
+      <w:pPr>
+        <w:ind w:left="200" w:hanging="200"/>
+        <w:spacing w:before="0" w:after="0" w:line="228" w:lineRule="auto"/>
+      </w:pPr>
+      <w:r>
+        <w:rPr>
+          <w:sz w:val="21"/>
+          <w:szCs w:val="21"/>
+        </w:rPr>
+        <w:t xml:space="preserve">• </w:t>
+      </w:r>
+      <w:r>
+        <w:rPr>
+          <w:sz w:val="21"/>
+          <w:szCs w:val="21"/>
+        </w:rPr>
+        <w:t>Audit and reconciliation procedures, daily deposits/advances/account-holder reporting, payroll and tax deductions, fixed-asset registers with depreciation, and monthly-to-annual financial statements.</w:t>
+      </w:r>
+    </w:p>
+    <w:p>
+      <w:pPr>
+        <w:keepNext/>
+        <w:keepLines/>
+        <w:spacing w:before="75" w:after="15" w:line="230" w:lineRule="auto"/>
+      </w:pPr>
+      <w:r>
+        <w:rPr>
+          <w:b/>
+          <w:sz w:val="21"/>
+          <w:szCs w:val="21"/>
+        </w:rPr>
+        <w:t>Communication &amp; Accounts Officer — Kay &amp; A (Pvt.) Limited</w:t>
+      </w:r>
+      <w:r>
+        <w:rPr>
+          <w:color w:val="3D4852"/>
+          <w:sz w:val="19"/>
+          <w:szCs w:val="19"/>
+        </w:rPr>
+        <w:t xml:space="preserve"> Oct 2006 – Feb 2007</w:t>
+      </w:r>
+    </w:p>
+    <w:p>
+      <w:pPr>
+        <w:ind w:left="200" w:hanging="200"/>
+        <w:spacing w:before="0" w:after="0" w:line="228" w:lineRule="auto"/>
+      </w:pPr>
+      <w:r>
+        <w:rPr>
+          <w:sz w:val="21"/>
+          <w:szCs w:val="21"/>
+        </w:rPr>
+        <w:t xml:space="preserve">• </w:t>
+      </w:r>
+      <w:r>
+        <w:rPr>
+          <w:sz w:val="21"/>
+          <w:szCs w:val="21"/>
+        </w:rPr>
+        <w:t>Organisational expenditure reporting, management scheduling and client-facing administrative support.</w:t>
       </w:r>
     </w:p>
     <w:p>
@@ -845,6 +876,103 @@
           <w:sz w:val="20"/>
           <w:szCs w:val="20"/>
         </w:rPr>
+        <w:t xml:space="preserve">Education</w:t>
+      </w:r>
+    </w:p>
+    <w:p>
+      <w:pPr>
+        <w:spacing w:before="0" w:after="15" w:line="230" w:lineRule="auto"/>
+      </w:pPr>
+      <w:r>
+        <w:rPr>
+          <w:b/>
+          <w:sz w:val="20"/>
+          <w:szCs w:val="20"/>
+        </w:rPr>
+        <w:t xml:space="preserve">Agentic AI &amp; Robotics Engineering — Panaversity / PIAIC, Batch 83</w:t>
+      </w:r>
+      <w:r>
+        <w:rPr>
+          <w:color w:val="3D4852"/>
+          <w:sz w:val="19"/>
+          <w:szCs w:val="19"/>
+        </w:rPr>
+        <w:t xml:space="preserve"> In progress · expected May 2027</w:t>
+      </w:r>
+    </w:p>
+    <w:p>
+      <w:pPr>
+        <w:spacing w:before="0" w:after="15" w:line="230" w:lineRule="auto"/>
+      </w:pPr>
+      <w:r>
+        <w:rPr>
+          <w:b/>
+          <w:sz w:val="20"/>
+          <w:szCs w:val="20"/>
+        </w:rPr>
+        <w:t xml:space="preserve">MSc Economics &amp; Finance — International Islamic University Islamabad</w:t>
+      </w:r>
+      <w:r>
+        <w:rPr>
+          <w:color w:val="3D4852"/>
+          <w:sz w:val="19"/>
+          <w:szCs w:val="19"/>
+        </w:rPr>
+        <w:t xml:space="preserve"> Distinction · CGPA 3.92 / 4.00</w:t>
+      </w:r>
+    </w:p>
+    <w:p>
+      <w:pPr>
+        <w:spacing w:before="0" w:after="15" w:line="230" w:lineRule="auto"/>
+      </w:pPr>
+      <w:r>
+        <w:rPr>
+          <w:b/>
+          <w:sz w:val="20"/>
+          <w:szCs w:val="20"/>
+        </w:rPr>
+        <w:t xml:space="preserve">Bachelor of Education — Allama Iqbal Open University</w:t>
+      </w:r>
+    </w:p>
+    <w:p>
+      <w:pPr>
+        <w:spacing w:before="0" w:after="15" w:line="230" w:lineRule="auto"/>
+      </w:pPr>
+      <w:r>
+        <w:rPr>
+          <w:b/>
+          <w:sz w:val="20"/>
+          <w:szCs w:val="20"/>
+        </w:rPr>
+        <w:t>Bachelor of Commerce — Punjab University</w:t>
+      </w:r>
+      <w:r>
+        <w:rPr>
+          <w:color w:val="3D4852"/>
+          <w:sz w:val="19"/>
+          <w:szCs w:val="19"/>
+        </w:rPr>
+        <w:t xml:space="preserve"> 1999 – 2001</w:t>
+      </w:r>
+    </w:p>
+    <w:p>
+      <w:pPr>
+        <w:keepNext/>
+        <w:keepLines/>
+        <w:pBdr>
+          <w:bottom w:val="single" w:sz="6" w:space="2" w:color="9AA5B1"/>
+        </w:pBdr>
+        <w:spacing w:before="120" w:after="45" w:line="230" w:lineRule="auto"/>
+      </w:pPr>
+      <w:r>
+        <w:rPr>
+          <w:b/>
+          <w:caps/>
+          <w:color w:val="1A1A1A"/>
+          <w:spacing w:val="30"/>
+          <w:sz w:val="20"/>
+          <w:szCs w:val="20"/>
+        </w:rPr>
         <w:t xml:space="preserve">Certifications</w:t>
       </w:r>
     </w:p>
@@ -857,7 +985,7 @@
           <w:sz w:val="20"/>
           <w:szCs w:val="20"/>
         </w:rPr>
-        <w:t xml:space="preserve">OpenClaw with General Agents (Jul 2026)  ·  Agent Factory Fundamentals: Building Digital FTEs (Jan 2026)  ·  General Agents Fundamentals Part 1 (Feb 2026)</w:t>
+        <w:t>OpenClaw with General Agents (Jul 2026)  ·  Agent Factory Fundamentals: Building Digital FTEs (Jan 2026)  ·  General Agents Fundamentals Part 1 (Feb 2026)  ·  General Banking Course (2007)</w:t>
       </w:r>
     </w:p>
     <w:p>

</xml_diff>